<commit_message>
Add data memory module & small fix
Data_Memory is uploaded with TB, some small fixes in register file TB were made
</commit_message>
<xml_diff>
--- a/CPU_Simulation_Pictures&Logs.docx
+++ b/CPU_Simulation_Pictures&Logs.docx
@@ -81,7 +81,7 @@
           <w:lang w:val="en-US"/>
         </w:rPr>
         <w:drawing>
-          <wp:inline distT="0" distB="0" distL="0" distR="0" wp14:anchorId="4D0C2A91" wp14:editId="7C921272">
+          <wp:inline distT="0" distB="0" distL="0" distR="0" wp14:anchorId="4D0C2A91" wp14:editId="378CFF5E">
             <wp:extent cx="5940425" cy="1557655"/>
             <wp:effectExtent l="0" t="0" r="3175" b="4445"/>
             <wp:docPr id="1" name="Picture 1"/>
@@ -140,6 +140,7 @@
           <w:lang w:val="en-US"/>
         </w:rPr>
       </w:pPr>
+      <w:proofErr w:type="spellStart"/>
       <w:r>
         <w:rPr>
           <w:b/>
@@ -148,316 +149,10 @@
           <w:szCs w:val="32"/>
           <w:lang w:val="en-US"/>
         </w:rPr>
-        <w:t>Loggs:</w:t>
-      </w:r>
-    </w:p>
-    <w:p>
-      <w:pPr>
-        <w:rPr>
-          <w:sz w:val="28"/>
-          <w:szCs w:val="28"/>
-          <w:lang w:val="en-US"/>
-        </w:rPr>
-      </w:pPr>
-      <w:r>
-        <w:rPr>
-          <w:sz w:val="28"/>
-          <w:szCs w:val="28"/>
-          <w:lang w:val="en-US"/>
-        </w:rPr>
-        <w:t>SUCCESS ADD: Expected result (  15) was received correctly</w:t>
-      </w:r>
-    </w:p>
-    <w:p>
-      <w:pPr>
-        <w:rPr>
-          <w:sz w:val="28"/>
-          <w:szCs w:val="28"/>
-          <w:lang w:val="en-US"/>
-        </w:rPr>
-      </w:pPr>
-      <w:r>
-        <w:rPr>
-          <w:sz w:val="28"/>
-          <w:szCs w:val="28"/>
-          <w:lang w:val="en-US"/>
-        </w:rPr>
-        <w:t>SUCCESS SUB: Exp</w:t>
-      </w:r>
-      <w:r>
-        <w:rPr>
-          <w:sz w:val="28"/>
-          <w:szCs w:val="28"/>
-          <w:lang w:val="en-US"/>
-        </w:rPr>
-        <w:t>e</w:t>
-      </w:r>
-      <w:r>
-        <w:rPr>
-          <w:sz w:val="28"/>
-          <w:szCs w:val="28"/>
-          <w:lang w:val="en-US"/>
-        </w:rPr>
-        <w:t>cted result (  -7) was received correctly</w:t>
-      </w:r>
-    </w:p>
-    <w:p>
-      <w:pPr>
-        <w:rPr>
-          <w:sz w:val="28"/>
-          <w:szCs w:val="28"/>
-          <w:lang w:val="en-US"/>
-        </w:rPr>
-      </w:pPr>
-      <w:r>
-        <w:rPr>
-          <w:sz w:val="28"/>
-          <w:szCs w:val="28"/>
-          <w:lang w:val="en-US"/>
-        </w:rPr>
-        <w:t>SUCCESS ADC: Expected result (  40) was received correctly</w:t>
-      </w:r>
-    </w:p>
-    <w:p>
-      <w:pPr>
-        <w:rPr>
-          <w:sz w:val="28"/>
-          <w:szCs w:val="28"/>
-          <w:lang w:val="en-US"/>
-        </w:rPr>
-      </w:pPr>
-      <w:r>
-        <w:rPr>
-          <w:sz w:val="28"/>
-          <w:szCs w:val="28"/>
-          <w:lang w:val="en-US"/>
-        </w:rPr>
-        <w:t>SUCCESS SUC: Expected result (  38) was received correctly</w:t>
-      </w:r>
-    </w:p>
-    <w:p>
-      <w:pPr>
-        <w:rPr>
-          <w:sz w:val="28"/>
-          <w:szCs w:val="28"/>
-          <w:lang w:val="en-US"/>
-        </w:rPr>
-      </w:pPr>
-      <w:r>
-        <w:rPr>
-          <w:sz w:val="28"/>
-          <w:szCs w:val="28"/>
-          <w:lang w:val="en-US"/>
-        </w:rPr>
-        <w:t>SUCCESS AND: Expected result (   0) was received correctly</w:t>
-      </w:r>
-    </w:p>
-    <w:p>
-      <w:pPr>
-        <w:rPr>
-          <w:sz w:val="28"/>
-          <w:szCs w:val="28"/>
-          <w:lang w:val="en-US"/>
-        </w:rPr>
-      </w:pPr>
-      <w:r>
-        <w:rPr>
-          <w:sz w:val="28"/>
-          <w:szCs w:val="28"/>
-          <w:lang w:val="en-US"/>
-        </w:rPr>
-        <w:t>SUCCESS OR: Expected result (   1) was received correctly</w:t>
-      </w:r>
-    </w:p>
-    <w:p>
-      <w:pPr>
-        <w:rPr>
-          <w:sz w:val="28"/>
-          <w:szCs w:val="28"/>
-          <w:lang w:val="en-US"/>
-        </w:rPr>
-      </w:pPr>
-      <w:r>
-        <w:rPr>
-          <w:sz w:val="28"/>
-          <w:szCs w:val="28"/>
-          <w:lang w:val="en-US"/>
-        </w:rPr>
-        <w:t>SUCCESS NEG: Expected result ( -48) was received correctly</w:t>
-      </w:r>
-    </w:p>
-    <w:p>
-      <w:pPr>
-        <w:rPr>
-          <w:sz w:val="28"/>
-          <w:szCs w:val="28"/>
-          <w:lang w:val="en-US"/>
-        </w:rPr>
-      </w:pPr>
-      <w:r>
-        <w:rPr>
-          <w:sz w:val="28"/>
-          <w:szCs w:val="28"/>
-          <w:lang w:val="en-US"/>
-        </w:rPr>
-        <w:t>SUCCESS &gt;&gt;&gt;: Exp</w:t>
-      </w:r>
-      <w:r>
-        <w:rPr>
-          <w:sz w:val="28"/>
-          <w:szCs w:val="28"/>
-          <w:lang w:val="en-US"/>
-        </w:rPr>
-        <w:t>e</w:t>
-      </w:r>
-      <w:r>
-        <w:rPr>
-          <w:sz w:val="28"/>
-          <w:szCs w:val="28"/>
-          <w:lang w:val="en-US"/>
-        </w:rPr>
-        <w:t>cted result (  32) was received correctly</w:t>
-      </w:r>
-    </w:p>
-    <w:p>
-      <w:pPr>
-        <w:rPr>
-          <w:sz w:val="28"/>
-          <w:szCs w:val="28"/>
-          <w:lang w:val="en-US"/>
-        </w:rPr>
-      </w:pPr>
-      <w:r>
-        <w:rPr>
-          <w:sz w:val="28"/>
-          <w:szCs w:val="28"/>
-          <w:lang w:val="en-US"/>
-        </w:rPr>
-        <w:t>SUCCESS &lt;&lt;&lt;: Exp</w:t>
-      </w:r>
-      <w:r>
-        <w:rPr>
-          <w:sz w:val="28"/>
-          <w:szCs w:val="28"/>
-          <w:lang w:val="en-US"/>
-        </w:rPr>
-        <w:t>e</w:t>
-      </w:r>
-      <w:r>
-        <w:rPr>
-          <w:sz w:val="28"/>
-          <w:szCs w:val="28"/>
-          <w:lang w:val="en-US"/>
-        </w:rPr>
-        <w:t>cted result (   8) was received correctly</w:t>
-      </w:r>
-    </w:p>
-    <w:p>
-      <w:pPr>
-        <w:rPr>
-          <w:sz w:val="28"/>
-          <w:szCs w:val="28"/>
-          <w:lang w:val="en-US"/>
-        </w:rPr>
-      </w:pPr>
-      <w:r>
-        <w:rPr>
-          <w:sz w:val="28"/>
-          <w:szCs w:val="28"/>
-          <w:lang w:val="en-US"/>
-        </w:rPr>
-        <w:t>SUCCESS NOT: Expected result (  -1) was received correctly</w:t>
-      </w:r>
-    </w:p>
-    <w:p>
-      <w:pPr>
-        <w:rPr>
-          <w:sz w:val="28"/>
-          <w:szCs w:val="28"/>
-          <w:lang w:val="en-US"/>
-        </w:rPr>
-      </w:pPr>
-      <w:r>
-        <w:rPr>
-          <w:sz w:val="28"/>
-          <w:szCs w:val="28"/>
-          <w:lang w:val="en-US"/>
-        </w:rPr>
-        <w:t>SUCCESS: Default value was set</w:t>
-      </w:r>
-    </w:p>
-    <w:p>
-      <w:pPr>
-        <w:rPr>
-          <w:sz w:val="28"/>
-          <w:szCs w:val="28"/>
-          <w:lang w:val="en-US"/>
-        </w:rPr>
-      </w:pPr>
-      <w:r>
-        <w:rPr>
-          <w:sz w:val="28"/>
-          <w:szCs w:val="28"/>
-          <w:lang w:val="en-US"/>
-        </w:rPr>
-        <w:t>SUCCESS: (+) Overflow was set</w:t>
-      </w:r>
-    </w:p>
-    <w:p>
-      <w:pPr>
-        <w:rPr>
-          <w:sz w:val="28"/>
-          <w:szCs w:val="28"/>
-          <w:lang w:val="en-US"/>
-        </w:rPr>
-      </w:pPr>
-      <w:r>
-        <w:rPr>
-          <w:sz w:val="28"/>
-          <w:szCs w:val="28"/>
-          <w:lang w:val="en-US"/>
-        </w:rPr>
-        <w:t>SUCCESS: (-) Overflow was set</w:t>
-      </w:r>
-    </w:p>
-    <w:p>
-      <w:pPr>
-        <w:rPr>
-          <w:sz w:val="28"/>
-          <w:szCs w:val="28"/>
-          <w:lang w:val="en-US"/>
-        </w:rPr>
-      </w:pPr>
-    </w:p>
-    <w:p>
-      <w:pPr>
-        <w:rPr>
-          <w:sz w:val="28"/>
-          <w:szCs w:val="28"/>
-          <w:lang w:val="en-US"/>
-        </w:rPr>
-      </w:pPr>
-    </w:p>
-    <w:p>
-      <w:pPr>
-        <w:rPr>
-          <w:sz w:val="28"/>
-          <w:szCs w:val="28"/>
-          <w:lang w:val="en-US"/>
-        </w:rPr>
-      </w:pPr>
-    </w:p>
-    <w:p>
-      <w:pPr>
-        <w:rPr>
-          <w:sz w:val="28"/>
-          <w:szCs w:val="28"/>
-          <w:lang w:val="en-US"/>
-        </w:rPr>
-      </w:pPr>
-    </w:p>
-    <w:p>
-      <w:pPr>
+        <w:t>Loggs</w:t>
+      </w:r>
+      <w:proofErr w:type="spellEnd"/>
+      <w:r>
         <w:rPr>
           <w:b/>
           <w:bCs/>
@@ -465,6 +160,474 @@
           <w:szCs w:val="32"/>
           <w:lang w:val="en-US"/>
         </w:rPr>
+        <w:t>:</w:t>
+      </w:r>
+    </w:p>
+    <w:p>
+      <w:pPr>
+        <w:rPr>
+          <w:sz w:val="28"/>
+          <w:szCs w:val="28"/>
+          <w:lang w:val="en-US"/>
+        </w:rPr>
+      </w:pPr>
+      <w:r>
+        <w:rPr>
+          <w:sz w:val="28"/>
+          <w:szCs w:val="28"/>
+          <w:lang w:val="en-US"/>
+        </w:rPr>
+        <w:t xml:space="preserve">SUCCESS ADD: Expected result </w:t>
+      </w:r>
+      <w:proofErr w:type="gramStart"/>
+      <w:r>
+        <w:rPr>
+          <w:sz w:val="28"/>
+          <w:szCs w:val="28"/>
+          <w:lang w:val="en-US"/>
+        </w:rPr>
+        <w:t>(  15</w:t>
+      </w:r>
+      <w:proofErr w:type="gramEnd"/>
+      <w:r>
+        <w:rPr>
+          <w:sz w:val="28"/>
+          <w:szCs w:val="28"/>
+          <w:lang w:val="en-US"/>
+        </w:rPr>
+        <w:t>) was received correctly</w:t>
+      </w:r>
+    </w:p>
+    <w:p>
+      <w:pPr>
+        <w:rPr>
+          <w:sz w:val="28"/>
+          <w:szCs w:val="28"/>
+          <w:lang w:val="en-US"/>
+        </w:rPr>
+      </w:pPr>
+      <w:r>
+        <w:rPr>
+          <w:sz w:val="28"/>
+          <w:szCs w:val="28"/>
+          <w:lang w:val="en-US"/>
+        </w:rPr>
+        <w:t>SUCCESS SUB: Exp</w:t>
+      </w:r>
+      <w:r>
+        <w:rPr>
+          <w:sz w:val="28"/>
+          <w:szCs w:val="28"/>
+          <w:lang w:val="en-US"/>
+        </w:rPr>
+        <w:t>e</w:t>
+      </w:r>
+      <w:r>
+        <w:rPr>
+          <w:sz w:val="28"/>
+          <w:szCs w:val="28"/>
+          <w:lang w:val="en-US"/>
+        </w:rPr>
+        <w:t xml:space="preserve">cted result </w:t>
+      </w:r>
+      <w:proofErr w:type="gramStart"/>
+      <w:r>
+        <w:rPr>
+          <w:sz w:val="28"/>
+          <w:szCs w:val="28"/>
+          <w:lang w:val="en-US"/>
+        </w:rPr>
+        <w:t>(  -</w:t>
+      </w:r>
+      <w:proofErr w:type="gramEnd"/>
+      <w:r>
+        <w:rPr>
+          <w:sz w:val="28"/>
+          <w:szCs w:val="28"/>
+          <w:lang w:val="en-US"/>
+        </w:rPr>
+        <w:t>7) was received correctly</w:t>
+      </w:r>
+    </w:p>
+    <w:p>
+      <w:pPr>
+        <w:rPr>
+          <w:sz w:val="28"/>
+          <w:szCs w:val="28"/>
+          <w:lang w:val="en-US"/>
+        </w:rPr>
+      </w:pPr>
+      <w:r>
+        <w:rPr>
+          <w:sz w:val="28"/>
+          <w:szCs w:val="28"/>
+          <w:lang w:val="en-US"/>
+        </w:rPr>
+        <w:t xml:space="preserve">SUCCESS ADC: Expected result </w:t>
+      </w:r>
+      <w:proofErr w:type="gramStart"/>
+      <w:r>
+        <w:rPr>
+          <w:sz w:val="28"/>
+          <w:szCs w:val="28"/>
+          <w:lang w:val="en-US"/>
+        </w:rPr>
+        <w:t>(  40</w:t>
+      </w:r>
+      <w:proofErr w:type="gramEnd"/>
+      <w:r>
+        <w:rPr>
+          <w:sz w:val="28"/>
+          <w:szCs w:val="28"/>
+          <w:lang w:val="en-US"/>
+        </w:rPr>
+        <w:t>) was received correctly</w:t>
+      </w:r>
+    </w:p>
+    <w:p>
+      <w:pPr>
+        <w:rPr>
+          <w:sz w:val="28"/>
+          <w:szCs w:val="28"/>
+          <w:lang w:val="en-US"/>
+        </w:rPr>
+      </w:pPr>
+      <w:r>
+        <w:rPr>
+          <w:sz w:val="28"/>
+          <w:szCs w:val="28"/>
+          <w:lang w:val="en-US"/>
+        </w:rPr>
+        <w:t xml:space="preserve">SUCCESS SUC: Expected result </w:t>
+      </w:r>
+      <w:proofErr w:type="gramStart"/>
+      <w:r>
+        <w:rPr>
+          <w:sz w:val="28"/>
+          <w:szCs w:val="28"/>
+          <w:lang w:val="en-US"/>
+        </w:rPr>
+        <w:t>(  38</w:t>
+      </w:r>
+      <w:proofErr w:type="gramEnd"/>
+      <w:r>
+        <w:rPr>
+          <w:sz w:val="28"/>
+          <w:szCs w:val="28"/>
+          <w:lang w:val="en-US"/>
+        </w:rPr>
+        <w:t>) was received correctly</w:t>
+      </w:r>
+    </w:p>
+    <w:p>
+      <w:pPr>
+        <w:rPr>
+          <w:sz w:val="28"/>
+          <w:szCs w:val="28"/>
+          <w:lang w:val="en-US"/>
+        </w:rPr>
+      </w:pPr>
+      <w:r>
+        <w:rPr>
+          <w:sz w:val="28"/>
+          <w:szCs w:val="28"/>
+          <w:lang w:val="en-US"/>
+        </w:rPr>
+        <w:t xml:space="preserve">SUCCESS AND: Expected result </w:t>
+      </w:r>
+      <w:proofErr w:type="gramStart"/>
+      <w:r>
+        <w:rPr>
+          <w:sz w:val="28"/>
+          <w:szCs w:val="28"/>
+          <w:lang w:val="en-US"/>
+        </w:rPr>
+        <w:t xml:space="preserve">(  </w:t>
+      </w:r>
+      <w:proofErr w:type="gramEnd"/>
+      <w:r>
+        <w:rPr>
+          <w:sz w:val="28"/>
+          <w:szCs w:val="28"/>
+          <w:lang w:val="en-US"/>
+        </w:rPr>
+        <w:t xml:space="preserve"> 0) was received correctly</w:t>
+      </w:r>
+    </w:p>
+    <w:p>
+      <w:pPr>
+        <w:rPr>
+          <w:sz w:val="28"/>
+          <w:szCs w:val="28"/>
+          <w:lang w:val="en-US"/>
+        </w:rPr>
+      </w:pPr>
+      <w:r>
+        <w:rPr>
+          <w:sz w:val="28"/>
+          <w:szCs w:val="28"/>
+          <w:lang w:val="en-US"/>
+        </w:rPr>
+        <w:t xml:space="preserve">SUCCESS OR: Expected result </w:t>
+      </w:r>
+      <w:proofErr w:type="gramStart"/>
+      <w:r>
+        <w:rPr>
+          <w:sz w:val="28"/>
+          <w:szCs w:val="28"/>
+          <w:lang w:val="en-US"/>
+        </w:rPr>
+        <w:t xml:space="preserve">(  </w:t>
+      </w:r>
+      <w:proofErr w:type="gramEnd"/>
+      <w:r>
+        <w:rPr>
+          <w:sz w:val="28"/>
+          <w:szCs w:val="28"/>
+          <w:lang w:val="en-US"/>
+        </w:rPr>
+        <w:t xml:space="preserve"> 1) was received correctly</w:t>
+      </w:r>
+    </w:p>
+    <w:p>
+      <w:pPr>
+        <w:rPr>
+          <w:sz w:val="28"/>
+          <w:szCs w:val="28"/>
+          <w:lang w:val="en-US"/>
+        </w:rPr>
+      </w:pPr>
+      <w:r>
+        <w:rPr>
+          <w:sz w:val="28"/>
+          <w:szCs w:val="28"/>
+          <w:lang w:val="en-US"/>
+        </w:rPr>
+        <w:t>SUCCESS NEG: Expected result ( -48) was received correctly</w:t>
+      </w:r>
+    </w:p>
+    <w:p>
+      <w:pPr>
+        <w:rPr>
+          <w:sz w:val="28"/>
+          <w:szCs w:val="28"/>
+          <w:lang w:val="en-US"/>
+        </w:rPr>
+      </w:pPr>
+      <w:r>
+        <w:rPr>
+          <w:sz w:val="28"/>
+          <w:szCs w:val="28"/>
+          <w:lang w:val="en-US"/>
+        </w:rPr>
+        <w:t>SUCCESS &gt;&gt;&gt;: Exp</w:t>
+      </w:r>
+      <w:r>
+        <w:rPr>
+          <w:sz w:val="28"/>
+          <w:szCs w:val="28"/>
+          <w:lang w:val="en-US"/>
+        </w:rPr>
+        <w:t>e</w:t>
+      </w:r>
+      <w:r>
+        <w:rPr>
+          <w:sz w:val="28"/>
+          <w:szCs w:val="28"/>
+          <w:lang w:val="en-US"/>
+        </w:rPr>
+        <w:t xml:space="preserve">cted result </w:t>
+      </w:r>
+      <w:proofErr w:type="gramStart"/>
+      <w:r>
+        <w:rPr>
+          <w:sz w:val="28"/>
+          <w:szCs w:val="28"/>
+          <w:lang w:val="en-US"/>
+        </w:rPr>
+        <w:t>(  32</w:t>
+      </w:r>
+      <w:proofErr w:type="gramEnd"/>
+      <w:r>
+        <w:rPr>
+          <w:sz w:val="28"/>
+          <w:szCs w:val="28"/>
+          <w:lang w:val="en-US"/>
+        </w:rPr>
+        <w:t>) was received correctly</w:t>
+      </w:r>
+    </w:p>
+    <w:p>
+      <w:pPr>
+        <w:rPr>
+          <w:sz w:val="28"/>
+          <w:szCs w:val="28"/>
+          <w:lang w:val="en-US"/>
+        </w:rPr>
+      </w:pPr>
+      <w:r>
+        <w:rPr>
+          <w:sz w:val="28"/>
+          <w:szCs w:val="28"/>
+          <w:lang w:val="en-US"/>
+        </w:rPr>
+        <w:t>SUCCESS &lt;&lt;&lt;: Exp</w:t>
+      </w:r>
+      <w:r>
+        <w:rPr>
+          <w:sz w:val="28"/>
+          <w:szCs w:val="28"/>
+          <w:lang w:val="en-US"/>
+        </w:rPr>
+        <w:t>e</w:t>
+      </w:r>
+      <w:r>
+        <w:rPr>
+          <w:sz w:val="28"/>
+          <w:szCs w:val="28"/>
+          <w:lang w:val="en-US"/>
+        </w:rPr>
+        <w:t xml:space="preserve">cted result </w:t>
+      </w:r>
+      <w:proofErr w:type="gramStart"/>
+      <w:r>
+        <w:rPr>
+          <w:sz w:val="28"/>
+          <w:szCs w:val="28"/>
+          <w:lang w:val="en-US"/>
+        </w:rPr>
+        <w:t xml:space="preserve">(  </w:t>
+      </w:r>
+      <w:proofErr w:type="gramEnd"/>
+      <w:r>
+        <w:rPr>
+          <w:sz w:val="28"/>
+          <w:szCs w:val="28"/>
+          <w:lang w:val="en-US"/>
+        </w:rPr>
+        <w:t xml:space="preserve"> 8) was received correctly</w:t>
+      </w:r>
+    </w:p>
+    <w:p>
+      <w:pPr>
+        <w:rPr>
+          <w:sz w:val="28"/>
+          <w:szCs w:val="28"/>
+          <w:lang w:val="en-US"/>
+        </w:rPr>
+      </w:pPr>
+      <w:r>
+        <w:rPr>
+          <w:sz w:val="28"/>
+          <w:szCs w:val="28"/>
+          <w:lang w:val="en-US"/>
+        </w:rPr>
+        <w:t xml:space="preserve">SUCCESS NOT: Expected result </w:t>
+      </w:r>
+      <w:proofErr w:type="gramStart"/>
+      <w:r>
+        <w:rPr>
+          <w:sz w:val="28"/>
+          <w:szCs w:val="28"/>
+          <w:lang w:val="en-US"/>
+        </w:rPr>
+        <w:t>(  -</w:t>
+      </w:r>
+      <w:proofErr w:type="gramEnd"/>
+      <w:r>
+        <w:rPr>
+          <w:sz w:val="28"/>
+          <w:szCs w:val="28"/>
+          <w:lang w:val="en-US"/>
+        </w:rPr>
+        <w:t>1) was received correctly</w:t>
+      </w:r>
+    </w:p>
+    <w:p>
+      <w:pPr>
+        <w:rPr>
+          <w:sz w:val="28"/>
+          <w:szCs w:val="28"/>
+          <w:lang w:val="en-US"/>
+        </w:rPr>
+      </w:pPr>
+      <w:r>
+        <w:rPr>
+          <w:sz w:val="28"/>
+          <w:szCs w:val="28"/>
+          <w:lang w:val="en-US"/>
+        </w:rPr>
+        <w:t>SUCCESS: Default value was set</w:t>
+      </w:r>
+    </w:p>
+    <w:p>
+      <w:pPr>
+        <w:rPr>
+          <w:sz w:val="28"/>
+          <w:szCs w:val="28"/>
+          <w:lang w:val="en-US"/>
+        </w:rPr>
+      </w:pPr>
+      <w:r>
+        <w:rPr>
+          <w:sz w:val="28"/>
+          <w:szCs w:val="28"/>
+          <w:lang w:val="en-US"/>
+        </w:rPr>
+        <w:t>SUCCESS: (+) Overflow was set</w:t>
+      </w:r>
+    </w:p>
+    <w:p>
+      <w:pPr>
+        <w:rPr>
+          <w:sz w:val="28"/>
+          <w:szCs w:val="28"/>
+          <w:lang w:val="en-US"/>
+        </w:rPr>
+      </w:pPr>
+      <w:r>
+        <w:rPr>
+          <w:sz w:val="28"/>
+          <w:szCs w:val="28"/>
+          <w:lang w:val="en-US"/>
+        </w:rPr>
+        <w:t>SUCCESS: (-) Overflow was set</w:t>
+      </w:r>
+    </w:p>
+    <w:p>
+      <w:pPr>
+        <w:rPr>
+          <w:sz w:val="28"/>
+          <w:szCs w:val="28"/>
+          <w:lang w:val="en-US"/>
+        </w:rPr>
+      </w:pPr>
+    </w:p>
+    <w:p>
+      <w:pPr>
+        <w:rPr>
+          <w:sz w:val="28"/>
+          <w:szCs w:val="28"/>
+          <w:lang w:val="en-US"/>
+        </w:rPr>
+      </w:pPr>
+    </w:p>
+    <w:p>
+      <w:pPr>
+        <w:rPr>
+          <w:sz w:val="28"/>
+          <w:szCs w:val="28"/>
+          <w:lang w:val="en-US"/>
+        </w:rPr>
+      </w:pPr>
+    </w:p>
+    <w:p>
+      <w:pPr>
+        <w:rPr>
+          <w:sz w:val="28"/>
+          <w:szCs w:val="28"/>
+          <w:lang w:val="en-US"/>
+        </w:rPr>
       </w:pPr>
     </w:p>
     <w:p>
@@ -477,7 +640,9 @@
           <w:lang w:val="en-US"/>
         </w:rPr>
       </w:pPr>
-      <w:r>
+    </w:p>
+    <w:p>
+      <w:pPr>
         <w:rPr>
           <w:b/>
           <w:bCs/>
@@ -485,9 +650,7 @@
           <w:szCs w:val="32"/>
           <w:lang w:val="en-US"/>
         </w:rPr>
-        <w:lastRenderedPageBreak/>
-        <w:t xml:space="preserve">2) </w:t>
-      </w:r>
+      </w:pPr>
       <w:r>
         <w:rPr>
           <w:b/>
@@ -496,19 +659,43 @@
           <w:szCs w:val="32"/>
           <w:lang w:val="en-US"/>
         </w:rPr>
-        <w:t>Register_File:</w:t>
-      </w:r>
-    </w:p>
-    <w:p>
-      <w:pPr>
-        <w:rPr>
-          <w:sz w:val="28"/>
-          <w:szCs w:val="28"/>
-          <w:lang w:val="en-US"/>
-        </w:rPr>
-      </w:pPr>
-      <w:r>
-        <w:rPr>
+        <w:lastRenderedPageBreak/>
+        <w:t xml:space="preserve">2) </w:t>
+      </w:r>
+      <w:proofErr w:type="spellStart"/>
+      <w:r>
+        <w:rPr>
+          <w:b/>
+          <w:bCs/>
+          <w:sz w:val="32"/>
+          <w:szCs w:val="32"/>
+          <w:lang w:val="en-US"/>
+        </w:rPr>
+        <w:t>Register_File</w:t>
+      </w:r>
+      <w:proofErr w:type="spellEnd"/>
+      <w:r>
+        <w:rPr>
+          <w:b/>
+          <w:bCs/>
+          <w:sz w:val="32"/>
+          <w:szCs w:val="32"/>
+          <w:lang w:val="en-US"/>
+        </w:rPr>
+        <w:t>:</w:t>
+      </w:r>
+    </w:p>
+    <w:p>
+      <w:pPr>
+        <w:rPr>
+          <w:sz w:val="28"/>
+          <w:szCs w:val="28"/>
+          <w:lang w:val="en-US"/>
+        </w:rPr>
+      </w:pPr>
+      <w:r>
+        <w:rPr>
+          <w:noProof/>
           <w:sz w:val="28"/>
           <w:szCs w:val="28"/>
           <w:lang w:val="en-US"/>
@@ -558,6 +745,7 @@
           <w:lang w:val="en-US"/>
         </w:rPr>
       </w:pPr>
+      <w:proofErr w:type="spellStart"/>
       <w:r>
         <w:rPr>
           <w:b/>
@@ -566,7 +754,18 @@
           <w:szCs w:val="32"/>
           <w:lang w:val="en-US"/>
         </w:rPr>
-        <w:t>Loggs:</w:t>
+        <w:t>Loggs</w:t>
+      </w:r>
+      <w:proofErr w:type="spellEnd"/>
+      <w:r>
+        <w:rPr>
+          <w:b/>
+          <w:bCs/>
+          <w:sz w:val="32"/>
+          <w:szCs w:val="32"/>
+          <w:lang w:val="en-US"/>
+        </w:rPr>
+        <w:t>:</w:t>
       </w:r>
       <w:r>
         <w:rPr>
@@ -599,7 +798,25 @@
           <w:szCs w:val="28"/>
           <w:lang w:val="en-US"/>
         </w:rPr>
-        <w:t>SUCCESS: Number  -38 was written in register_1</w:t>
+        <w:t xml:space="preserve">SUCCESS: </w:t>
+      </w:r>
+      <w:proofErr w:type="gramStart"/>
+      <w:r>
+        <w:rPr>
+          <w:sz w:val="28"/>
+          <w:szCs w:val="28"/>
+          <w:lang w:val="en-US"/>
+        </w:rPr>
+        <w:t>Number  -</w:t>
+      </w:r>
+      <w:proofErr w:type="gramEnd"/>
+      <w:r>
+        <w:rPr>
+          <w:sz w:val="28"/>
+          <w:szCs w:val="28"/>
+          <w:lang w:val="en-US"/>
+        </w:rPr>
+        <w:t>38 was written in register_1</w:t>
       </w:r>
     </w:p>
     <w:p>
@@ -634,6 +851,459 @@
           <w:lang w:val="en-US"/>
         </w:rPr>
         <w:t>SUCCESS: register_1 is unchanged</w:t>
+      </w:r>
+    </w:p>
+    <w:p>
+      <w:pPr>
+        <w:rPr>
+          <w:sz w:val="28"/>
+          <w:szCs w:val="28"/>
+          <w:lang w:val="en-US"/>
+        </w:rPr>
+      </w:pPr>
+    </w:p>
+    <w:p>
+      <w:pPr>
+        <w:rPr>
+          <w:sz w:val="28"/>
+          <w:szCs w:val="28"/>
+          <w:lang w:val="en-US"/>
+        </w:rPr>
+      </w:pPr>
+    </w:p>
+    <w:p>
+      <w:pPr>
+        <w:rPr>
+          <w:sz w:val="28"/>
+          <w:szCs w:val="28"/>
+          <w:lang w:val="en-US"/>
+        </w:rPr>
+      </w:pPr>
+    </w:p>
+    <w:p>
+      <w:pPr>
+        <w:rPr>
+          <w:sz w:val="28"/>
+          <w:szCs w:val="28"/>
+          <w:lang w:val="en-US"/>
+        </w:rPr>
+      </w:pPr>
+    </w:p>
+    <w:p>
+      <w:pPr>
+        <w:rPr>
+          <w:sz w:val="28"/>
+          <w:szCs w:val="28"/>
+          <w:lang w:val="en-US"/>
+        </w:rPr>
+      </w:pPr>
+    </w:p>
+    <w:p>
+      <w:pPr>
+        <w:rPr>
+          <w:sz w:val="28"/>
+          <w:szCs w:val="28"/>
+          <w:lang w:val="en-US"/>
+        </w:rPr>
+      </w:pPr>
+    </w:p>
+    <w:p>
+      <w:pPr>
+        <w:rPr>
+          <w:sz w:val="28"/>
+          <w:szCs w:val="28"/>
+          <w:lang w:val="en-US"/>
+        </w:rPr>
+      </w:pPr>
+    </w:p>
+    <w:p>
+      <w:pPr>
+        <w:rPr>
+          <w:sz w:val="28"/>
+          <w:szCs w:val="28"/>
+          <w:lang w:val="en-US"/>
+        </w:rPr>
+      </w:pPr>
+    </w:p>
+    <w:p>
+      <w:pPr>
+        <w:rPr>
+          <w:sz w:val="28"/>
+          <w:szCs w:val="28"/>
+          <w:lang w:val="en-US"/>
+        </w:rPr>
+      </w:pPr>
+    </w:p>
+    <w:p>
+      <w:pPr>
+        <w:rPr>
+          <w:sz w:val="28"/>
+          <w:szCs w:val="28"/>
+          <w:lang w:val="en-US"/>
+        </w:rPr>
+      </w:pPr>
+    </w:p>
+    <w:p>
+      <w:pPr>
+        <w:rPr>
+          <w:sz w:val="28"/>
+          <w:szCs w:val="28"/>
+          <w:lang w:val="en-US"/>
+        </w:rPr>
+      </w:pPr>
+    </w:p>
+    <w:p>
+      <w:pPr>
+        <w:rPr>
+          <w:sz w:val="28"/>
+          <w:szCs w:val="28"/>
+          <w:lang w:val="en-US"/>
+        </w:rPr>
+      </w:pPr>
+    </w:p>
+    <w:p>
+      <w:pPr>
+        <w:rPr>
+          <w:sz w:val="28"/>
+          <w:szCs w:val="28"/>
+          <w:lang w:val="en-US"/>
+        </w:rPr>
+      </w:pPr>
+    </w:p>
+    <w:p>
+      <w:pPr>
+        <w:rPr>
+          <w:sz w:val="28"/>
+          <w:szCs w:val="28"/>
+          <w:lang w:val="en-US"/>
+        </w:rPr>
+      </w:pPr>
+    </w:p>
+    <w:p>
+      <w:pPr>
+        <w:rPr>
+          <w:sz w:val="28"/>
+          <w:szCs w:val="28"/>
+          <w:lang w:val="en-US"/>
+        </w:rPr>
+      </w:pPr>
+    </w:p>
+    <w:p>
+      <w:pPr>
+        <w:rPr>
+          <w:sz w:val="28"/>
+          <w:szCs w:val="28"/>
+          <w:lang w:val="en-US"/>
+        </w:rPr>
+      </w:pPr>
+    </w:p>
+    <w:p>
+      <w:pPr>
+        <w:rPr>
+          <w:b/>
+          <w:bCs/>
+          <w:sz w:val="32"/>
+          <w:szCs w:val="32"/>
+          <w:lang w:val="en-US"/>
+        </w:rPr>
+      </w:pPr>
+      <w:r>
+        <w:rPr>
+          <w:b/>
+          <w:bCs/>
+          <w:sz w:val="32"/>
+          <w:szCs w:val="32"/>
+          <w:lang w:val="en-US"/>
+        </w:rPr>
+        <w:lastRenderedPageBreak/>
+        <w:t xml:space="preserve">3) </w:t>
+      </w:r>
+      <w:proofErr w:type="spellStart"/>
+      <w:r>
+        <w:rPr>
+          <w:b/>
+          <w:bCs/>
+          <w:sz w:val="32"/>
+          <w:szCs w:val="32"/>
+          <w:lang w:val="en-US"/>
+        </w:rPr>
+        <w:t>Data_Memory</w:t>
+      </w:r>
+      <w:proofErr w:type="spellEnd"/>
+      <w:r>
+        <w:rPr>
+          <w:b/>
+          <w:bCs/>
+          <w:sz w:val="32"/>
+          <w:szCs w:val="32"/>
+          <w:lang w:val="en-US"/>
+        </w:rPr>
+        <w:t>:</w:t>
+      </w:r>
+    </w:p>
+    <w:p>
+      <w:pPr>
+        <w:rPr>
+          <w:b/>
+          <w:bCs/>
+          <w:sz w:val="32"/>
+          <w:szCs w:val="32"/>
+          <w:lang w:val="en-US"/>
+        </w:rPr>
+      </w:pPr>
+      <w:r>
+        <w:rPr>
+          <w:b/>
+          <w:bCs/>
+          <w:sz w:val="32"/>
+          <w:szCs w:val="32"/>
+          <w:lang w:val="en-US"/>
+        </w:rPr>
+        <w:drawing>
+          <wp:inline distT="0" distB="0" distL="0" distR="0" wp14:anchorId="4C8DC66F" wp14:editId="1073C7F9">
+            <wp:extent cx="5940425" cy="1222375"/>
+            <wp:effectExtent l="0" t="0" r="3175" b="0"/>
+            <wp:docPr id="4" name="Picture 4"/>
+            <wp:cNvGraphicFramePr>
+              <a:graphicFrameLocks xmlns:a="http://schemas.openxmlformats.org/drawingml/2006/main" noChangeAspect="1"/>
+            </wp:cNvGraphicFramePr>
+            <a:graphic xmlns:a="http://schemas.openxmlformats.org/drawingml/2006/main">
+              <a:graphicData uri="http://schemas.openxmlformats.org/drawingml/2006/picture">
+                <pic:pic xmlns:pic="http://schemas.openxmlformats.org/drawingml/2006/picture">
+                  <pic:nvPicPr>
+                    <pic:cNvPr id="1" name=""/>
+                    <pic:cNvPicPr/>
+                  </pic:nvPicPr>
+                  <pic:blipFill>
+                    <a:blip r:embed="rId6"/>
+                    <a:stretch>
+                      <a:fillRect/>
+                    </a:stretch>
+                  </pic:blipFill>
+                  <pic:spPr>
+                    <a:xfrm>
+                      <a:off x="0" y="0"/>
+                      <a:ext cx="5940425" cy="1222375"/>
+                    </a:xfrm>
+                    <a:prstGeom prst="rect">
+                      <a:avLst/>
+                    </a:prstGeom>
+                  </pic:spPr>
+                </pic:pic>
+              </a:graphicData>
+            </a:graphic>
+          </wp:inline>
+        </w:drawing>
+      </w:r>
+    </w:p>
+    <w:p>
+      <w:pPr>
+        <w:rPr>
+          <w:sz w:val="28"/>
+          <w:szCs w:val="28"/>
+          <w:lang w:val="en-US"/>
+        </w:rPr>
+      </w:pPr>
+      <w:proofErr w:type="spellStart"/>
+      <w:r>
+        <w:rPr>
+          <w:b/>
+          <w:bCs/>
+          <w:sz w:val="32"/>
+          <w:szCs w:val="32"/>
+          <w:lang w:val="en-US"/>
+        </w:rPr>
+        <w:t>Loggs</w:t>
+      </w:r>
+      <w:proofErr w:type="spellEnd"/>
+      <w:r>
+        <w:rPr>
+          <w:b/>
+          <w:bCs/>
+          <w:sz w:val="32"/>
+          <w:szCs w:val="32"/>
+          <w:lang w:val="en-US"/>
+        </w:rPr>
+        <w:t>:</w:t>
+      </w:r>
+      <w:r>
+        <w:rPr>
+          <w:sz w:val="28"/>
+          <w:szCs w:val="28"/>
+          <w:lang w:val="en-US"/>
+        </w:rPr>
+        <w:br/>
+      </w:r>
+      <w:r>
+        <w:rPr>
+          <w:sz w:val="28"/>
+          <w:szCs w:val="28"/>
+          <w:lang w:val="en-US"/>
+        </w:rPr>
+        <w:t xml:space="preserve">SUCCESS: Expected data </w:t>
+      </w:r>
+      <w:proofErr w:type="gramStart"/>
+      <w:r>
+        <w:rPr>
+          <w:sz w:val="28"/>
+          <w:szCs w:val="28"/>
+          <w:lang w:val="en-US"/>
+        </w:rPr>
+        <w:t>(  13</w:t>
+      </w:r>
+      <w:proofErr w:type="gramEnd"/>
+      <w:r>
+        <w:rPr>
+          <w:sz w:val="28"/>
+          <w:szCs w:val="28"/>
+          <w:lang w:val="en-US"/>
+        </w:rPr>
+        <w:t>) was written to the ad</w:t>
+      </w:r>
+      <w:r>
+        <w:rPr>
+          <w:sz w:val="28"/>
+          <w:szCs w:val="28"/>
+          <w:lang w:val="en-US"/>
+        </w:rPr>
+        <w:t>d</w:t>
+      </w:r>
+      <w:r>
+        <w:rPr>
+          <w:sz w:val="28"/>
+          <w:szCs w:val="28"/>
+          <w:lang w:val="en-US"/>
+        </w:rPr>
+        <w:t>ress cell   0</w:t>
+      </w:r>
+    </w:p>
+    <w:p>
+      <w:pPr>
+        <w:rPr>
+          <w:sz w:val="28"/>
+          <w:szCs w:val="28"/>
+          <w:lang w:val="en-US"/>
+        </w:rPr>
+      </w:pPr>
+      <w:r>
+        <w:rPr>
+          <w:sz w:val="28"/>
+          <w:szCs w:val="28"/>
+          <w:lang w:val="en-US"/>
+        </w:rPr>
+        <w:t>SUCCESS: Expected data ( -64) was written to the ad</w:t>
+      </w:r>
+      <w:r>
+        <w:rPr>
+          <w:sz w:val="28"/>
+          <w:szCs w:val="28"/>
+          <w:lang w:val="en-US"/>
+        </w:rPr>
+        <w:t>d</w:t>
+      </w:r>
+      <w:r>
+        <w:rPr>
+          <w:sz w:val="28"/>
+          <w:szCs w:val="28"/>
+          <w:lang w:val="en-US"/>
+        </w:rPr>
+        <w:t xml:space="preserve">ress </w:t>
+      </w:r>
+      <w:proofErr w:type="gramStart"/>
+      <w:r>
+        <w:rPr>
+          <w:sz w:val="28"/>
+          <w:szCs w:val="28"/>
+          <w:lang w:val="en-US"/>
+        </w:rPr>
+        <w:t>cell  17</w:t>
+      </w:r>
+      <w:proofErr w:type="gramEnd"/>
+    </w:p>
+    <w:p>
+      <w:pPr>
+        <w:rPr>
+          <w:sz w:val="28"/>
+          <w:szCs w:val="28"/>
+          <w:lang w:val="en-US"/>
+        </w:rPr>
+      </w:pPr>
+      <w:r>
+        <w:rPr>
+          <w:sz w:val="28"/>
+          <w:szCs w:val="28"/>
+          <w:lang w:val="en-US"/>
+        </w:rPr>
+        <w:t>SUCCESS: Ad</w:t>
+      </w:r>
+      <w:r>
+        <w:rPr>
+          <w:sz w:val="28"/>
+          <w:szCs w:val="28"/>
+          <w:lang w:val="en-US"/>
+        </w:rPr>
+        <w:t>d</w:t>
+      </w:r>
+      <w:r>
+        <w:rPr>
+          <w:sz w:val="28"/>
+          <w:szCs w:val="28"/>
+          <w:lang w:val="en-US"/>
+        </w:rPr>
+        <w:t>ress cell   0 was reset to zero</w:t>
+      </w:r>
+    </w:p>
+    <w:p>
+      <w:pPr>
+        <w:rPr>
+          <w:b/>
+          <w:bCs/>
+          <w:sz w:val="32"/>
+          <w:szCs w:val="32"/>
+          <w:lang w:val="en-US"/>
+        </w:rPr>
+      </w:pPr>
+      <w:r>
+        <w:rPr>
+          <w:sz w:val="28"/>
+          <w:szCs w:val="28"/>
+          <w:lang w:val="en-US"/>
+        </w:rPr>
+        <w:t>SUCCESS: Ad</w:t>
+      </w:r>
+      <w:r>
+        <w:rPr>
+          <w:sz w:val="28"/>
+          <w:szCs w:val="28"/>
+          <w:lang w:val="en-US"/>
+        </w:rPr>
+        <w:t>dr</w:t>
+      </w:r>
+      <w:r>
+        <w:rPr>
+          <w:sz w:val="28"/>
+          <w:szCs w:val="28"/>
+          <w:lang w:val="en-US"/>
+        </w:rPr>
+        <w:t xml:space="preserve">ess </w:t>
+      </w:r>
+      <w:proofErr w:type="gramStart"/>
+      <w:r>
+        <w:rPr>
+          <w:sz w:val="28"/>
+          <w:szCs w:val="28"/>
+          <w:lang w:val="en-US"/>
+        </w:rPr>
+        <w:t>cell  17</w:t>
+      </w:r>
+      <w:proofErr w:type="gramEnd"/>
+      <w:r>
+        <w:rPr>
+          <w:sz w:val="28"/>
+          <w:szCs w:val="28"/>
+          <w:lang w:val="en-US"/>
+        </w:rPr>
+        <w:t xml:space="preserve"> was reset to zero</w:t>
       </w:r>
     </w:p>
     <w:sectPr>

</xml_diff>

<commit_message>
Data memory module fix & small register file fix
</commit_message>
<xml_diff>
--- a/CPU_Simulation_Pictures&Logs.docx
+++ b/CPU_Simulation_Pictures&Logs.docx
@@ -81,7 +81,7 @@
           <w:lang w:val="en-US"/>
         </w:rPr>
         <w:drawing>
-          <wp:inline distT="0" distB="0" distL="0" distR="0" wp14:anchorId="4D0C2A91" wp14:editId="378CFF5E">
+          <wp:inline distT="0" distB="0" distL="0" distR="0" wp14:anchorId="4D0C2A91" wp14:editId="5E32732D">
             <wp:extent cx="5940425" cy="1557655"/>
             <wp:effectExtent l="0" t="0" r="3175" b="4445"/>
             <wp:docPr id="1" name="Picture 1"/>
@@ -140,7 +140,6 @@
           <w:lang w:val="en-US"/>
         </w:rPr>
       </w:pPr>
-      <w:proofErr w:type="spellStart"/>
       <w:r>
         <w:rPr>
           <w:b/>
@@ -149,10 +148,316 @@
           <w:szCs w:val="32"/>
           <w:lang w:val="en-US"/>
         </w:rPr>
-        <w:t>Loggs</w:t>
-      </w:r>
-      <w:proofErr w:type="spellEnd"/>
-      <w:r>
+        <w:t>Loggs:</w:t>
+      </w:r>
+    </w:p>
+    <w:p>
+      <w:pPr>
+        <w:rPr>
+          <w:sz w:val="28"/>
+          <w:szCs w:val="28"/>
+          <w:lang w:val="en-US"/>
+        </w:rPr>
+      </w:pPr>
+      <w:r>
+        <w:rPr>
+          <w:sz w:val="28"/>
+          <w:szCs w:val="28"/>
+          <w:lang w:val="en-US"/>
+        </w:rPr>
+        <w:t>SUCCESS ADD: Expected result (  15) was received correctly</w:t>
+      </w:r>
+    </w:p>
+    <w:p>
+      <w:pPr>
+        <w:rPr>
+          <w:sz w:val="28"/>
+          <w:szCs w:val="28"/>
+          <w:lang w:val="en-US"/>
+        </w:rPr>
+      </w:pPr>
+      <w:r>
+        <w:rPr>
+          <w:sz w:val="28"/>
+          <w:szCs w:val="28"/>
+          <w:lang w:val="en-US"/>
+        </w:rPr>
+        <w:t>SUCCESS SUB: Exp</w:t>
+      </w:r>
+      <w:r>
+        <w:rPr>
+          <w:sz w:val="28"/>
+          <w:szCs w:val="28"/>
+          <w:lang w:val="en-US"/>
+        </w:rPr>
+        <w:t>e</w:t>
+      </w:r>
+      <w:r>
+        <w:rPr>
+          <w:sz w:val="28"/>
+          <w:szCs w:val="28"/>
+          <w:lang w:val="en-US"/>
+        </w:rPr>
+        <w:t>cted result (  -7) was received correctly</w:t>
+      </w:r>
+    </w:p>
+    <w:p>
+      <w:pPr>
+        <w:rPr>
+          <w:sz w:val="28"/>
+          <w:szCs w:val="28"/>
+          <w:lang w:val="en-US"/>
+        </w:rPr>
+      </w:pPr>
+      <w:r>
+        <w:rPr>
+          <w:sz w:val="28"/>
+          <w:szCs w:val="28"/>
+          <w:lang w:val="en-US"/>
+        </w:rPr>
+        <w:t>SUCCESS ADC: Expected result (  40) was received correctly</w:t>
+      </w:r>
+    </w:p>
+    <w:p>
+      <w:pPr>
+        <w:rPr>
+          <w:sz w:val="28"/>
+          <w:szCs w:val="28"/>
+          <w:lang w:val="en-US"/>
+        </w:rPr>
+      </w:pPr>
+      <w:r>
+        <w:rPr>
+          <w:sz w:val="28"/>
+          <w:szCs w:val="28"/>
+          <w:lang w:val="en-US"/>
+        </w:rPr>
+        <w:t>SUCCESS SUC: Expected result (  38) was received correctly</w:t>
+      </w:r>
+    </w:p>
+    <w:p>
+      <w:pPr>
+        <w:rPr>
+          <w:sz w:val="28"/>
+          <w:szCs w:val="28"/>
+          <w:lang w:val="en-US"/>
+        </w:rPr>
+      </w:pPr>
+      <w:r>
+        <w:rPr>
+          <w:sz w:val="28"/>
+          <w:szCs w:val="28"/>
+          <w:lang w:val="en-US"/>
+        </w:rPr>
+        <w:t>SUCCESS AND: Expected result (   0) was received correctly</w:t>
+      </w:r>
+    </w:p>
+    <w:p>
+      <w:pPr>
+        <w:rPr>
+          <w:sz w:val="28"/>
+          <w:szCs w:val="28"/>
+          <w:lang w:val="en-US"/>
+        </w:rPr>
+      </w:pPr>
+      <w:r>
+        <w:rPr>
+          <w:sz w:val="28"/>
+          <w:szCs w:val="28"/>
+          <w:lang w:val="en-US"/>
+        </w:rPr>
+        <w:t>SUCCESS OR: Expected result (   1) was received correctly</w:t>
+      </w:r>
+    </w:p>
+    <w:p>
+      <w:pPr>
+        <w:rPr>
+          <w:sz w:val="28"/>
+          <w:szCs w:val="28"/>
+          <w:lang w:val="en-US"/>
+        </w:rPr>
+      </w:pPr>
+      <w:r>
+        <w:rPr>
+          <w:sz w:val="28"/>
+          <w:szCs w:val="28"/>
+          <w:lang w:val="en-US"/>
+        </w:rPr>
+        <w:t>SUCCESS NEG: Expected result ( -48) was received correctly</w:t>
+      </w:r>
+    </w:p>
+    <w:p>
+      <w:pPr>
+        <w:rPr>
+          <w:sz w:val="28"/>
+          <w:szCs w:val="28"/>
+          <w:lang w:val="en-US"/>
+        </w:rPr>
+      </w:pPr>
+      <w:r>
+        <w:rPr>
+          <w:sz w:val="28"/>
+          <w:szCs w:val="28"/>
+          <w:lang w:val="en-US"/>
+        </w:rPr>
+        <w:t>SUCCESS &gt;&gt;&gt;: Exp</w:t>
+      </w:r>
+      <w:r>
+        <w:rPr>
+          <w:sz w:val="28"/>
+          <w:szCs w:val="28"/>
+          <w:lang w:val="en-US"/>
+        </w:rPr>
+        <w:t>e</w:t>
+      </w:r>
+      <w:r>
+        <w:rPr>
+          <w:sz w:val="28"/>
+          <w:szCs w:val="28"/>
+          <w:lang w:val="en-US"/>
+        </w:rPr>
+        <w:t>cted result (  32) was received correctly</w:t>
+      </w:r>
+    </w:p>
+    <w:p>
+      <w:pPr>
+        <w:rPr>
+          <w:sz w:val="28"/>
+          <w:szCs w:val="28"/>
+          <w:lang w:val="en-US"/>
+        </w:rPr>
+      </w:pPr>
+      <w:r>
+        <w:rPr>
+          <w:sz w:val="28"/>
+          <w:szCs w:val="28"/>
+          <w:lang w:val="en-US"/>
+        </w:rPr>
+        <w:t>SUCCESS &lt;&lt;&lt;: Exp</w:t>
+      </w:r>
+      <w:r>
+        <w:rPr>
+          <w:sz w:val="28"/>
+          <w:szCs w:val="28"/>
+          <w:lang w:val="en-US"/>
+        </w:rPr>
+        <w:t>e</w:t>
+      </w:r>
+      <w:r>
+        <w:rPr>
+          <w:sz w:val="28"/>
+          <w:szCs w:val="28"/>
+          <w:lang w:val="en-US"/>
+        </w:rPr>
+        <w:t>cted result (   8) was received correctly</w:t>
+      </w:r>
+    </w:p>
+    <w:p>
+      <w:pPr>
+        <w:rPr>
+          <w:sz w:val="28"/>
+          <w:szCs w:val="28"/>
+          <w:lang w:val="en-US"/>
+        </w:rPr>
+      </w:pPr>
+      <w:r>
+        <w:rPr>
+          <w:sz w:val="28"/>
+          <w:szCs w:val="28"/>
+          <w:lang w:val="en-US"/>
+        </w:rPr>
+        <w:t>SUCCESS NOT: Expected result (  -1) was received correctly</w:t>
+      </w:r>
+    </w:p>
+    <w:p>
+      <w:pPr>
+        <w:rPr>
+          <w:sz w:val="28"/>
+          <w:szCs w:val="28"/>
+          <w:lang w:val="en-US"/>
+        </w:rPr>
+      </w:pPr>
+      <w:r>
+        <w:rPr>
+          <w:sz w:val="28"/>
+          <w:szCs w:val="28"/>
+          <w:lang w:val="en-US"/>
+        </w:rPr>
+        <w:t>SUCCESS: Default value was set</w:t>
+      </w:r>
+    </w:p>
+    <w:p>
+      <w:pPr>
+        <w:rPr>
+          <w:sz w:val="28"/>
+          <w:szCs w:val="28"/>
+          <w:lang w:val="en-US"/>
+        </w:rPr>
+      </w:pPr>
+      <w:r>
+        <w:rPr>
+          <w:sz w:val="28"/>
+          <w:szCs w:val="28"/>
+          <w:lang w:val="en-US"/>
+        </w:rPr>
+        <w:t>SUCCESS: (+) Overflow was set</w:t>
+      </w:r>
+    </w:p>
+    <w:p>
+      <w:pPr>
+        <w:rPr>
+          <w:sz w:val="28"/>
+          <w:szCs w:val="28"/>
+          <w:lang w:val="en-US"/>
+        </w:rPr>
+      </w:pPr>
+      <w:r>
+        <w:rPr>
+          <w:sz w:val="28"/>
+          <w:szCs w:val="28"/>
+          <w:lang w:val="en-US"/>
+        </w:rPr>
+        <w:t>SUCCESS: (-) Overflow was set</w:t>
+      </w:r>
+    </w:p>
+    <w:p>
+      <w:pPr>
+        <w:rPr>
+          <w:sz w:val="28"/>
+          <w:szCs w:val="28"/>
+          <w:lang w:val="en-US"/>
+        </w:rPr>
+      </w:pPr>
+    </w:p>
+    <w:p>
+      <w:pPr>
+        <w:rPr>
+          <w:sz w:val="28"/>
+          <w:szCs w:val="28"/>
+          <w:lang w:val="en-US"/>
+        </w:rPr>
+      </w:pPr>
+    </w:p>
+    <w:p>
+      <w:pPr>
+        <w:rPr>
+          <w:sz w:val="28"/>
+          <w:szCs w:val="28"/>
+          <w:lang w:val="en-US"/>
+        </w:rPr>
+      </w:pPr>
+    </w:p>
+    <w:p>
+      <w:pPr>
+        <w:rPr>
+          <w:sz w:val="28"/>
+          <w:szCs w:val="28"/>
+          <w:lang w:val="en-US"/>
+        </w:rPr>
+      </w:pPr>
+    </w:p>
+    <w:p>
+      <w:pPr>
         <w:rPr>
           <w:b/>
           <w:bCs/>
@@ -160,474 +465,6 @@
           <w:szCs w:val="32"/>
           <w:lang w:val="en-US"/>
         </w:rPr>
-        <w:t>:</w:t>
-      </w:r>
-    </w:p>
-    <w:p>
-      <w:pPr>
-        <w:rPr>
-          <w:sz w:val="28"/>
-          <w:szCs w:val="28"/>
-          <w:lang w:val="en-US"/>
-        </w:rPr>
-      </w:pPr>
-      <w:r>
-        <w:rPr>
-          <w:sz w:val="28"/>
-          <w:szCs w:val="28"/>
-          <w:lang w:val="en-US"/>
-        </w:rPr>
-        <w:t xml:space="preserve">SUCCESS ADD: Expected result </w:t>
-      </w:r>
-      <w:proofErr w:type="gramStart"/>
-      <w:r>
-        <w:rPr>
-          <w:sz w:val="28"/>
-          <w:szCs w:val="28"/>
-          <w:lang w:val="en-US"/>
-        </w:rPr>
-        <w:t>(  15</w:t>
-      </w:r>
-      <w:proofErr w:type="gramEnd"/>
-      <w:r>
-        <w:rPr>
-          <w:sz w:val="28"/>
-          <w:szCs w:val="28"/>
-          <w:lang w:val="en-US"/>
-        </w:rPr>
-        <w:t>) was received correctly</w:t>
-      </w:r>
-    </w:p>
-    <w:p>
-      <w:pPr>
-        <w:rPr>
-          <w:sz w:val="28"/>
-          <w:szCs w:val="28"/>
-          <w:lang w:val="en-US"/>
-        </w:rPr>
-      </w:pPr>
-      <w:r>
-        <w:rPr>
-          <w:sz w:val="28"/>
-          <w:szCs w:val="28"/>
-          <w:lang w:val="en-US"/>
-        </w:rPr>
-        <w:t>SUCCESS SUB: Exp</w:t>
-      </w:r>
-      <w:r>
-        <w:rPr>
-          <w:sz w:val="28"/>
-          <w:szCs w:val="28"/>
-          <w:lang w:val="en-US"/>
-        </w:rPr>
-        <w:t>e</w:t>
-      </w:r>
-      <w:r>
-        <w:rPr>
-          <w:sz w:val="28"/>
-          <w:szCs w:val="28"/>
-          <w:lang w:val="en-US"/>
-        </w:rPr>
-        <w:t xml:space="preserve">cted result </w:t>
-      </w:r>
-      <w:proofErr w:type="gramStart"/>
-      <w:r>
-        <w:rPr>
-          <w:sz w:val="28"/>
-          <w:szCs w:val="28"/>
-          <w:lang w:val="en-US"/>
-        </w:rPr>
-        <w:t>(  -</w:t>
-      </w:r>
-      <w:proofErr w:type="gramEnd"/>
-      <w:r>
-        <w:rPr>
-          <w:sz w:val="28"/>
-          <w:szCs w:val="28"/>
-          <w:lang w:val="en-US"/>
-        </w:rPr>
-        <w:t>7) was received correctly</w:t>
-      </w:r>
-    </w:p>
-    <w:p>
-      <w:pPr>
-        <w:rPr>
-          <w:sz w:val="28"/>
-          <w:szCs w:val="28"/>
-          <w:lang w:val="en-US"/>
-        </w:rPr>
-      </w:pPr>
-      <w:r>
-        <w:rPr>
-          <w:sz w:val="28"/>
-          <w:szCs w:val="28"/>
-          <w:lang w:val="en-US"/>
-        </w:rPr>
-        <w:t xml:space="preserve">SUCCESS ADC: Expected result </w:t>
-      </w:r>
-      <w:proofErr w:type="gramStart"/>
-      <w:r>
-        <w:rPr>
-          <w:sz w:val="28"/>
-          <w:szCs w:val="28"/>
-          <w:lang w:val="en-US"/>
-        </w:rPr>
-        <w:t>(  40</w:t>
-      </w:r>
-      <w:proofErr w:type="gramEnd"/>
-      <w:r>
-        <w:rPr>
-          <w:sz w:val="28"/>
-          <w:szCs w:val="28"/>
-          <w:lang w:val="en-US"/>
-        </w:rPr>
-        <w:t>) was received correctly</w:t>
-      </w:r>
-    </w:p>
-    <w:p>
-      <w:pPr>
-        <w:rPr>
-          <w:sz w:val="28"/>
-          <w:szCs w:val="28"/>
-          <w:lang w:val="en-US"/>
-        </w:rPr>
-      </w:pPr>
-      <w:r>
-        <w:rPr>
-          <w:sz w:val="28"/>
-          <w:szCs w:val="28"/>
-          <w:lang w:val="en-US"/>
-        </w:rPr>
-        <w:t xml:space="preserve">SUCCESS SUC: Expected result </w:t>
-      </w:r>
-      <w:proofErr w:type="gramStart"/>
-      <w:r>
-        <w:rPr>
-          <w:sz w:val="28"/>
-          <w:szCs w:val="28"/>
-          <w:lang w:val="en-US"/>
-        </w:rPr>
-        <w:t>(  38</w:t>
-      </w:r>
-      <w:proofErr w:type="gramEnd"/>
-      <w:r>
-        <w:rPr>
-          <w:sz w:val="28"/>
-          <w:szCs w:val="28"/>
-          <w:lang w:val="en-US"/>
-        </w:rPr>
-        <w:t>) was received correctly</w:t>
-      </w:r>
-    </w:p>
-    <w:p>
-      <w:pPr>
-        <w:rPr>
-          <w:sz w:val="28"/>
-          <w:szCs w:val="28"/>
-          <w:lang w:val="en-US"/>
-        </w:rPr>
-      </w:pPr>
-      <w:r>
-        <w:rPr>
-          <w:sz w:val="28"/>
-          <w:szCs w:val="28"/>
-          <w:lang w:val="en-US"/>
-        </w:rPr>
-        <w:t xml:space="preserve">SUCCESS AND: Expected result </w:t>
-      </w:r>
-      <w:proofErr w:type="gramStart"/>
-      <w:r>
-        <w:rPr>
-          <w:sz w:val="28"/>
-          <w:szCs w:val="28"/>
-          <w:lang w:val="en-US"/>
-        </w:rPr>
-        <w:t xml:space="preserve">(  </w:t>
-      </w:r>
-      <w:proofErr w:type="gramEnd"/>
-      <w:r>
-        <w:rPr>
-          <w:sz w:val="28"/>
-          <w:szCs w:val="28"/>
-          <w:lang w:val="en-US"/>
-        </w:rPr>
-        <w:t xml:space="preserve"> 0) was received correctly</w:t>
-      </w:r>
-    </w:p>
-    <w:p>
-      <w:pPr>
-        <w:rPr>
-          <w:sz w:val="28"/>
-          <w:szCs w:val="28"/>
-          <w:lang w:val="en-US"/>
-        </w:rPr>
-      </w:pPr>
-      <w:r>
-        <w:rPr>
-          <w:sz w:val="28"/>
-          <w:szCs w:val="28"/>
-          <w:lang w:val="en-US"/>
-        </w:rPr>
-        <w:t xml:space="preserve">SUCCESS OR: Expected result </w:t>
-      </w:r>
-      <w:proofErr w:type="gramStart"/>
-      <w:r>
-        <w:rPr>
-          <w:sz w:val="28"/>
-          <w:szCs w:val="28"/>
-          <w:lang w:val="en-US"/>
-        </w:rPr>
-        <w:t xml:space="preserve">(  </w:t>
-      </w:r>
-      <w:proofErr w:type="gramEnd"/>
-      <w:r>
-        <w:rPr>
-          <w:sz w:val="28"/>
-          <w:szCs w:val="28"/>
-          <w:lang w:val="en-US"/>
-        </w:rPr>
-        <w:t xml:space="preserve"> 1) was received correctly</w:t>
-      </w:r>
-    </w:p>
-    <w:p>
-      <w:pPr>
-        <w:rPr>
-          <w:sz w:val="28"/>
-          <w:szCs w:val="28"/>
-          <w:lang w:val="en-US"/>
-        </w:rPr>
-      </w:pPr>
-      <w:r>
-        <w:rPr>
-          <w:sz w:val="28"/>
-          <w:szCs w:val="28"/>
-          <w:lang w:val="en-US"/>
-        </w:rPr>
-        <w:t>SUCCESS NEG: Expected result ( -48) was received correctly</w:t>
-      </w:r>
-    </w:p>
-    <w:p>
-      <w:pPr>
-        <w:rPr>
-          <w:sz w:val="28"/>
-          <w:szCs w:val="28"/>
-          <w:lang w:val="en-US"/>
-        </w:rPr>
-      </w:pPr>
-      <w:r>
-        <w:rPr>
-          <w:sz w:val="28"/>
-          <w:szCs w:val="28"/>
-          <w:lang w:val="en-US"/>
-        </w:rPr>
-        <w:t>SUCCESS &gt;&gt;&gt;: Exp</w:t>
-      </w:r>
-      <w:r>
-        <w:rPr>
-          <w:sz w:val="28"/>
-          <w:szCs w:val="28"/>
-          <w:lang w:val="en-US"/>
-        </w:rPr>
-        <w:t>e</w:t>
-      </w:r>
-      <w:r>
-        <w:rPr>
-          <w:sz w:val="28"/>
-          <w:szCs w:val="28"/>
-          <w:lang w:val="en-US"/>
-        </w:rPr>
-        <w:t xml:space="preserve">cted result </w:t>
-      </w:r>
-      <w:proofErr w:type="gramStart"/>
-      <w:r>
-        <w:rPr>
-          <w:sz w:val="28"/>
-          <w:szCs w:val="28"/>
-          <w:lang w:val="en-US"/>
-        </w:rPr>
-        <w:t>(  32</w:t>
-      </w:r>
-      <w:proofErr w:type="gramEnd"/>
-      <w:r>
-        <w:rPr>
-          <w:sz w:val="28"/>
-          <w:szCs w:val="28"/>
-          <w:lang w:val="en-US"/>
-        </w:rPr>
-        <w:t>) was received correctly</w:t>
-      </w:r>
-    </w:p>
-    <w:p>
-      <w:pPr>
-        <w:rPr>
-          <w:sz w:val="28"/>
-          <w:szCs w:val="28"/>
-          <w:lang w:val="en-US"/>
-        </w:rPr>
-      </w:pPr>
-      <w:r>
-        <w:rPr>
-          <w:sz w:val="28"/>
-          <w:szCs w:val="28"/>
-          <w:lang w:val="en-US"/>
-        </w:rPr>
-        <w:t>SUCCESS &lt;&lt;&lt;: Exp</w:t>
-      </w:r>
-      <w:r>
-        <w:rPr>
-          <w:sz w:val="28"/>
-          <w:szCs w:val="28"/>
-          <w:lang w:val="en-US"/>
-        </w:rPr>
-        <w:t>e</w:t>
-      </w:r>
-      <w:r>
-        <w:rPr>
-          <w:sz w:val="28"/>
-          <w:szCs w:val="28"/>
-          <w:lang w:val="en-US"/>
-        </w:rPr>
-        <w:t xml:space="preserve">cted result </w:t>
-      </w:r>
-      <w:proofErr w:type="gramStart"/>
-      <w:r>
-        <w:rPr>
-          <w:sz w:val="28"/>
-          <w:szCs w:val="28"/>
-          <w:lang w:val="en-US"/>
-        </w:rPr>
-        <w:t xml:space="preserve">(  </w:t>
-      </w:r>
-      <w:proofErr w:type="gramEnd"/>
-      <w:r>
-        <w:rPr>
-          <w:sz w:val="28"/>
-          <w:szCs w:val="28"/>
-          <w:lang w:val="en-US"/>
-        </w:rPr>
-        <w:t xml:space="preserve"> 8) was received correctly</w:t>
-      </w:r>
-    </w:p>
-    <w:p>
-      <w:pPr>
-        <w:rPr>
-          <w:sz w:val="28"/>
-          <w:szCs w:val="28"/>
-          <w:lang w:val="en-US"/>
-        </w:rPr>
-      </w:pPr>
-      <w:r>
-        <w:rPr>
-          <w:sz w:val="28"/>
-          <w:szCs w:val="28"/>
-          <w:lang w:val="en-US"/>
-        </w:rPr>
-        <w:t xml:space="preserve">SUCCESS NOT: Expected result </w:t>
-      </w:r>
-      <w:proofErr w:type="gramStart"/>
-      <w:r>
-        <w:rPr>
-          <w:sz w:val="28"/>
-          <w:szCs w:val="28"/>
-          <w:lang w:val="en-US"/>
-        </w:rPr>
-        <w:t>(  -</w:t>
-      </w:r>
-      <w:proofErr w:type="gramEnd"/>
-      <w:r>
-        <w:rPr>
-          <w:sz w:val="28"/>
-          <w:szCs w:val="28"/>
-          <w:lang w:val="en-US"/>
-        </w:rPr>
-        <w:t>1) was received correctly</w:t>
-      </w:r>
-    </w:p>
-    <w:p>
-      <w:pPr>
-        <w:rPr>
-          <w:sz w:val="28"/>
-          <w:szCs w:val="28"/>
-          <w:lang w:val="en-US"/>
-        </w:rPr>
-      </w:pPr>
-      <w:r>
-        <w:rPr>
-          <w:sz w:val="28"/>
-          <w:szCs w:val="28"/>
-          <w:lang w:val="en-US"/>
-        </w:rPr>
-        <w:t>SUCCESS: Default value was set</w:t>
-      </w:r>
-    </w:p>
-    <w:p>
-      <w:pPr>
-        <w:rPr>
-          <w:sz w:val="28"/>
-          <w:szCs w:val="28"/>
-          <w:lang w:val="en-US"/>
-        </w:rPr>
-      </w:pPr>
-      <w:r>
-        <w:rPr>
-          <w:sz w:val="28"/>
-          <w:szCs w:val="28"/>
-          <w:lang w:val="en-US"/>
-        </w:rPr>
-        <w:t>SUCCESS: (+) Overflow was set</w:t>
-      </w:r>
-    </w:p>
-    <w:p>
-      <w:pPr>
-        <w:rPr>
-          <w:sz w:val="28"/>
-          <w:szCs w:val="28"/>
-          <w:lang w:val="en-US"/>
-        </w:rPr>
-      </w:pPr>
-      <w:r>
-        <w:rPr>
-          <w:sz w:val="28"/>
-          <w:szCs w:val="28"/>
-          <w:lang w:val="en-US"/>
-        </w:rPr>
-        <w:t>SUCCESS: (-) Overflow was set</w:t>
-      </w:r>
-    </w:p>
-    <w:p>
-      <w:pPr>
-        <w:rPr>
-          <w:sz w:val="28"/>
-          <w:szCs w:val="28"/>
-          <w:lang w:val="en-US"/>
-        </w:rPr>
-      </w:pPr>
-    </w:p>
-    <w:p>
-      <w:pPr>
-        <w:rPr>
-          <w:sz w:val="28"/>
-          <w:szCs w:val="28"/>
-          <w:lang w:val="en-US"/>
-        </w:rPr>
-      </w:pPr>
-    </w:p>
-    <w:p>
-      <w:pPr>
-        <w:rPr>
-          <w:sz w:val="28"/>
-          <w:szCs w:val="28"/>
-          <w:lang w:val="en-US"/>
-        </w:rPr>
-      </w:pPr>
-    </w:p>
-    <w:p>
-      <w:pPr>
-        <w:rPr>
-          <w:sz w:val="28"/>
-          <w:szCs w:val="28"/>
-          <w:lang w:val="en-US"/>
-        </w:rPr>
       </w:pPr>
     </w:p>
     <w:p>
@@ -640,9 +477,7 @@
           <w:lang w:val="en-US"/>
         </w:rPr>
       </w:pPr>
-    </w:p>
-    <w:p>
-      <w:pPr>
+      <w:r>
         <w:rPr>
           <w:b/>
           <w:bCs/>
@@ -650,7 +485,9 @@
           <w:szCs w:val="32"/>
           <w:lang w:val="en-US"/>
         </w:rPr>
-      </w:pPr>
+        <w:lastRenderedPageBreak/>
+        <w:t xml:space="preserve">2) </w:t>
+      </w:r>
       <w:r>
         <w:rPr>
           <w:b/>
@@ -659,30 +496,7 @@
           <w:szCs w:val="32"/>
           <w:lang w:val="en-US"/>
         </w:rPr>
-        <w:lastRenderedPageBreak/>
-        <w:t xml:space="preserve">2) </w:t>
-      </w:r>
-      <w:proofErr w:type="spellStart"/>
-      <w:r>
-        <w:rPr>
-          <w:b/>
-          <w:bCs/>
-          <w:sz w:val="32"/>
-          <w:szCs w:val="32"/>
-          <w:lang w:val="en-US"/>
-        </w:rPr>
-        <w:t>Register_File</w:t>
-      </w:r>
-      <w:proofErr w:type="spellEnd"/>
-      <w:r>
-        <w:rPr>
-          <w:b/>
-          <w:bCs/>
-          <w:sz w:val="32"/>
-          <w:szCs w:val="32"/>
-          <w:lang w:val="en-US"/>
-        </w:rPr>
-        <w:t>:</w:t>
+        <w:t>Register_File:</w:t>
       </w:r>
     </w:p>
     <w:p>
@@ -745,7 +559,6 @@
           <w:lang w:val="en-US"/>
         </w:rPr>
       </w:pPr>
-      <w:proofErr w:type="spellStart"/>
       <w:r>
         <w:rPr>
           <w:b/>
@@ -754,10 +567,222 @@
           <w:szCs w:val="32"/>
           <w:lang w:val="en-US"/>
         </w:rPr>
-        <w:t>Loggs</w:t>
-      </w:r>
-      <w:proofErr w:type="spellEnd"/>
-      <w:r>
+        <w:t>Loggs:</w:t>
+      </w:r>
+      <w:r>
+        <w:rPr>
+          <w:sz w:val="28"/>
+          <w:szCs w:val="28"/>
+          <w:lang w:val="en-US"/>
+        </w:rPr>
+        <w:br/>
+      </w:r>
+      <w:r>
+        <w:rPr>
+          <w:sz w:val="28"/>
+          <w:szCs w:val="28"/>
+          <w:lang w:val="en-US"/>
+        </w:rPr>
+        <w:t>SUCCESS: Number   24 was written in register_0</w:t>
+      </w:r>
+    </w:p>
+    <w:p>
+      <w:pPr>
+        <w:rPr>
+          <w:sz w:val="28"/>
+          <w:szCs w:val="28"/>
+          <w:lang w:val="en-US"/>
+        </w:rPr>
+      </w:pPr>
+      <w:r>
+        <w:rPr>
+          <w:sz w:val="28"/>
+          <w:szCs w:val="28"/>
+          <w:lang w:val="en-US"/>
+        </w:rPr>
+        <w:t>SUCCESS: Number  -38 was written in register_1</w:t>
+      </w:r>
+    </w:p>
+    <w:p>
+      <w:pPr>
+        <w:rPr>
+          <w:sz w:val="28"/>
+          <w:szCs w:val="28"/>
+          <w:lang w:val="en-US"/>
+        </w:rPr>
+      </w:pPr>
+      <w:r>
+        <w:rPr>
+          <w:sz w:val="28"/>
+          <w:szCs w:val="28"/>
+          <w:lang w:val="en-US"/>
+        </w:rPr>
+        <w:t>SUCCESS: register_0 is unchanged</w:t>
+      </w:r>
+    </w:p>
+    <w:p>
+      <w:pPr>
+        <w:rPr>
+          <w:sz w:val="28"/>
+          <w:szCs w:val="28"/>
+          <w:lang w:val="en-US"/>
+        </w:rPr>
+      </w:pPr>
+      <w:r>
+        <w:rPr>
+          <w:sz w:val="28"/>
+          <w:szCs w:val="28"/>
+          <w:lang w:val="en-US"/>
+        </w:rPr>
+        <w:t>SUCCESS: register_1 is unchanged</w:t>
+      </w:r>
+    </w:p>
+    <w:p>
+      <w:pPr>
+        <w:rPr>
+          <w:sz w:val="28"/>
+          <w:szCs w:val="28"/>
+          <w:lang w:val="en-US"/>
+        </w:rPr>
+      </w:pPr>
+    </w:p>
+    <w:p>
+      <w:pPr>
+        <w:rPr>
+          <w:sz w:val="28"/>
+          <w:szCs w:val="28"/>
+          <w:lang w:val="en-US"/>
+        </w:rPr>
+      </w:pPr>
+    </w:p>
+    <w:p>
+      <w:pPr>
+        <w:rPr>
+          <w:sz w:val="28"/>
+          <w:szCs w:val="28"/>
+          <w:lang w:val="en-US"/>
+        </w:rPr>
+      </w:pPr>
+    </w:p>
+    <w:p>
+      <w:pPr>
+        <w:rPr>
+          <w:sz w:val="28"/>
+          <w:szCs w:val="28"/>
+          <w:lang w:val="en-US"/>
+        </w:rPr>
+      </w:pPr>
+    </w:p>
+    <w:p>
+      <w:pPr>
+        <w:rPr>
+          <w:sz w:val="28"/>
+          <w:szCs w:val="28"/>
+          <w:lang w:val="en-US"/>
+        </w:rPr>
+      </w:pPr>
+    </w:p>
+    <w:p>
+      <w:pPr>
+        <w:rPr>
+          <w:sz w:val="28"/>
+          <w:szCs w:val="28"/>
+          <w:lang w:val="en-US"/>
+        </w:rPr>
+      </w:pPr>
+    </w:p>
+    <w:p>
+      <w:pPr>
+        <w:rPr>
+          <w:sz w:val="28"/>
+          <w:szCs w:val="28"/>
+          <w:lang w:val="en-US"/>
+        </w:rPr>
+      </w:pPr>
+    </w:p>
+    <w:p>
+      <w:pPr>
+        <w:rPr>
+          <w:sz w:val="28"/>
+          <w:szCs w:val="28"/>
+          <w:lang w:val="en-US"/>
+        </w:rPr>
+      </w:pPr>
+    </w:p>
+    <w:p>
+      <w:pPr>
+        <w:rPr>
+          <w:sz w:val="28"/>
+          <w:szCs w:val="28"/>
+          <w:lang w:val="en-US"/>
+        </w:rPr>
+      </w:pPr>
+    </w:p>
+    <w:p>
+      <w:pPr>
+        <w:rPr>
+          <w:sz w:val="28"/>
+          <w:szCs w:val="28"/>
+          <w:lang w:val="en-US"/>
+        </w:rPr>
+      </w:pPr>
+    </w:p>
+    <w:p>
+      <w:pPr>
+        <w:rPr>
+          <w:sz w:val="28"/>
+          <w:szCs w:val="28"/>
+          <w:lang w:val="en-US"/>
+        </w:rPr>
+      </w:pPr>
+    </w:p>
+    <w:p>
+      <w:pPr>
+        <w:rPr>
+          <w:sz w:val="28"/>
+          <w:szCs w:val="28"/>
+          <w:lang w:val="en-US"/>
+        </w:rPr>
+      </w:pPr>
+    </w:p>
+    <w:p>
+      <w:pPr>
+        <w:rPr>
+          <w:sz w:val="28"/>
+          <w:szCs w:val="28"/>
+          <w:lang w:val="en-US"/>
+        </w:rPr>
+      </w:pPr>
+    </w:p>
+    <w:p>
+      <w:pPr>
+        <w:rPr>
+          <w:sz w:val="28"/>
+          <w:szCs w:val="28"/>
+          <w:lang w:val="en-US"/>
+        </w:rPr>
+      </w:pPr>
+    </w:p>
+    <w:p>
+      <w:pPr>
+        <w:rPr>
+          <w:sz w:val="28"/>
+          <w:szCs w:val="28"/>
+          <w:lang w:val="en-US"/>
+        </w:rPr>
+      </w:pPr>
+    </w:p>
+    <w:p>
+      <w:pPr>
+        <w:rPr>
+          <w:sz w:val="28"/>
+          <w:szCs w:val="28"/>
+          <w:lang w:val="en-US"/>
+        </w:rPr>
+      </w:pPr>
+    </w:p>
+    <w:p>
+      <w:pPr>
         <w:rPr>
           <w:b/>
           <w:bCs/>
@@ -765,240 +790,8 @@
           <w:szCs w:val="32"/>
           <w:lang w:val="en-US"/>
         </w:rPr>
-        <w:t>:</w:t>
-      </w:r>
-      <w:r>
-        <w:rPr>
-          <w:sz w:val="28"/>
-          <w:szCs w:val="28"/>
-          <w:lang w:val="en-US"/>
-        </w:rPr>
-        <w:br/>
-      </w:r>
-      <w:r>
-        <w:rPr>
-          <w:sz w:val="28"/>
-          <w:szCs w:val="28"/>
-          <w:lang w:val="en-US"/>
-        </w:rPr>
-        <w:t>SUCCESS: Number   24 was written in register_0</w:t>
-      </w:r>
-    </w:p>
-    <w:p>
-      <w:pPr>
-        <w:rPr>
-          <w:sz w:val="28"/>
-          <w:szCs w:val="28"/>
-          <w:lang w:val="en-US"/>
-        </w:rPr>
-      </w:pPr>
-      <w:r>
-        <w:rPr>
-          <w:sz w:val="28"/>
-          <w:szCs w:val="28"/>
-          <w:lang w:val="en-US"/>
-        </w:rPr>
-        <w:t xml:space="preserve">SUCCESS: </w:t>
-      </w:r>
-      <w:proofErr w:type="gramStart"/>
-      <w:r>
-        <w:rPr>
-          <w:sz w:val="28"/>
-          <w:szCs w:val="28"/>
-          <w:lang w:val="en-US"/>
-        </w:rPr>
-        <w:t>Number  -</w:t>
-      </w:r>
-      <w:proofErr w:type="gramEnd"/>
-      <w:r>
-        <w:rPr>
-          <w:sz w:val="28"/>
-          <w:szCs w:val="28"/>
-          <w:lang w:val="en-US"/>
-        </w:rPr>
-        <w:t>38 was written in register_1</w:t>
-      </w:r>
-    </w:p>
-    <w:p>
-      <w:pPr>
-        <w:rPr>
-          <w:sz w:val="28"/>
-          <w:szCs w:val="28"/>
-          <w:lang w:val="en-US"/>
-        </w:rPr>
-      </w:pPr>
-      <w:r>
-        <w:rPr>
-          <w:sz w:val="28"/>
-          <w:szCs w:val="28"/>
-          <w:lang w:val="en-US"/>
-        </w:rPr>
-        <w:t>SUCCESS: register_0 is unchanged</w:t>
-      </w:r>
-    </w:p>
-    <w:p>
-      <w:pPr>
-        <w:rPr>
-          <w:sz w:val="28"/>
-          <w:szCs w:val="28"/>
-          <w:lang w:val="en-US"/>
-        </w:rPr>
-      </w:pPr>
-      <w:r>
-        <w:rPr>
-          <w:sz w:val="28"/>
-          <w:szCs w:val="28"/>
-          <w:lang w:val="en-US"/>
-        </w:rPr>
-        <w:t>SUCCESS: register_1 is unchanged</w:t>
-      </w:r>
-    </w:p>
-    <w:p>
-      <w:pPr>
-        <w:rPr>
-          <w:sz w:val="28"/>
-          <w:szCs w:val="28"/>
-          <w:lang w:val="en-US"/>
-        </w:rPr>
-      </w:pPr>
-    </w:p>
-    <w:p>
-      <w:pPr>
-        <w:rPr>
-          <w:sz w:val="28"/>
-          <w:szCs w:val="28"/>
-          <w:lang w:val="en-US"/>
-        </w:rPr>
-      </w:pPr>
-    </w:p>
-    <w:p>
-      <w:pPr>
-        <w:rPr>
-          <w:sz w:val="28"/>
-          <w:szCs w:val="28"/>
-          <w:lang w:val="en-US"/>
-        </w:rPr>
-      </w:pPr>
-    </w:p>
-    <w:p>
-      <w:pPr>
-        <w:rPr>
-          <w:sz w:val="28"/>
-          <w:szCs w:val="28"/>
-          <w:lang w:val="en-US"/>
-        </w:rPr>
-      </w:pPr>
-    </w:p>
-    <w:p>
-      <w:pPr>
-        <w:rPr>
-          <w:sz w:val="28"/>
-          <w:szCs w:val="28"/>
-          <w:lang w:val="en-US"/>
-        </w:rPr>
-      </w:pPr>
-    </w:p>
-    <w:p>
-      <w:pPr>
-        <w:rPr>
-          <w:sz w:val="28"/>
-          <w:szCs w:val="28"/>
-          <w:lang w:val="en-US"/>
-        </w:rPr>
-      </w:pPr>
-    </w:p>
-    <w:p>
-      <w:pPr>
-        <w:rPr>
-          <w:sz w:val="28"/>
-          <w:szCs w:val="28"/>
-          <w:lang w:val="en-US"/>
-        </w:rPr>
-      </w:pPr>
-    </w:p>
-    <w:p>
-      <w:pPr>
-        <w:rPr>
-          <w:sz w:val="28"/>
-          <w:szCs w:val="28"/>
-          <w:lang w:val="en-US"/>
-        </w:rPr>
-      </w:pPr>
-    </w:p>
-    <w:p>
-      <w:pPr>
-        <w:rPr>
-          <w:sz w:val="28"/>
-          <w:szCs w:val="28"/>
-          <w:lang w:val="en-US"/>
-        </w:rPr>
-      </w:pPr>
-    </w:p>
-    <w:p>
-      <w:pPr>
-        <w:rPr>
-          <w:sz w:val="28"/>
-          <w:szCs w:val="28"/>
-          <w:lang w:val="en-US"/>
-        </w:rPr>
-      </w:pPr>
-    </w:p>
-    <w:p>
-      <w:pPr>
-        <w:rPr>
-          <w:sz w:val="28"/>
-          <w:szCs w:val="28"/>
-          <w:lang w:val="en-US"/>
-        </w:rPr>
-      </w:pPr>
-    </w:p>
-    <w:p>
-      <w:pPr>
-        <w:rPr>
-          <w:sz w:val="28"/>
-          <w:szCs w:val="28"/>
-          <w:lang w:val="en-US"/>
-        </w:rPr>
-      </w:pPr>
-    </w:p>
-    <w:p>
-      <w:pPr>
-        <w:rPr>
-          <w:sz w:val="28"/>
-          <w:szCs w:val="28"/>
-          <w:lang w:val="en-US"/>
-        </w:rPr>
-      </w:pPr>
-    </w:p>
-    <w:p>
-      <w:pPr>
-        <w:rPr>
-          <w:sz w:val="28"/>
-          <w:szCs w:val="28"/>
-          <w:lang w:val="en-US"/>
-        </w:rPr>
-      </w:pPr>
-    </w:p>
-    <w:p>
-      <w:pPr>
-        <w:rPr>
-          <w:sz w:val="28"/>
-          <w:szCs w:val="28"/>
-          <w:lang w:val="en-US"/>
-        </w:rPr>
-      </w:pPr>
-    </w:p>
-    <w:p>
-      <w:pPr>
-        <w:rPr>
-          <w:sz w:val="28"/>
-          <w:szCs w:val="28"/>
-          <w:lang w:val="en-US"/>
-        </w:rPr>
-      </w:pPr>
-    </w:p>
-    <w:p>
-      <w:pPr>
+      </w:pPr>
+      <w:r>
         <w:rPr>
           <w:b/>
           <w:bCs/>
@@ -1006,7 +799,9 @@
           <w:szCs w:val="32"/>
           <w:lang w:val="en-US"/>
         </w:rPr>
-      </w:pPr>
+        <w:lastRenderedPageBreak/>
+        <w:t>3) Data_Memory</w:t>
+      </w:r>
       <w:r>
         <w:rPr>
           <w:b/>
@@ -1015,11 +810,11 @@
           <w:szCs w:val="32"/>
           <w:lang w:val="en-US"/>
         </w:rPr>
-        <w:lastRenderedPageBreak/>
-        <w:t xml:space="preserve">3) </w:t>
-      </w:r>
-      <w:proofErr w:type="spellStart"/>
-      <w:r>
+        <w:t>:</w:t>
+      </w:r>
+    </w:p>
+    <w:p>
+      <w:pPr>
         <w:rPr>
           <w:b/>
           <w:bCs/>
@@ -1027,9 +822,7 @@
           <w:szCs w:val="32"/>
           <w:lang w:val="en-US"/>
         </w:rPr>
-        <w:t>Data_Memory</w:t>
-      </w:r>
-      <w:proofErr w:type="spellEnd"/>
+      </w:pPr>
       <w:r>
         <w:rPr>
           <w:b/>
@@ -1038,32 +831,11 @@
           <w:szCs w:val="32"/>
           <w:lang w:val="en-US"/>
         </w:rPr>
-        <w:t>:</w:t>
-      </w:r>
-    </w:p>
-    <w:p>
-      <w:pPr>
-        <w:rPr>
-          <w:b/>
-          <w:bCs/>
-          <w:sz w:val="32"/>
-          <w:szCs w:val="32"/>
-          <w:lang w:val="en-US"/>
-        </w:rPr>
-      </w:pPr>
-      <w:r>
-        <w:rPr>
-          <w:b/>
-          <w:bCs/>
-          <w:sz w:val="32"/>
-          <w:szCs w:val="32"/>
-          <w:lang w:val="en-US"/>
-        </w:rPr>
         <w:drawing>
-          <wp:inline distT="0" distB="0" distL="0" distR="0" wp14:anchorId="4C8DC66F" wp14:editId="1073C7F9">
-            <wp:extent cx="5940425" cy="1222375"/>
-            <wp:effectExtent l="0" t="0" r="3175" b="0"/>
-            <wp:docPr id="4" name="Picture 4"/>
+          <wp:inline distT="0" distB="0" distL="0" distR="0" wp14:anchorId="7737F949" wp14:editId="0A6BA1FF">
+            <wp:extent cx="5940425" cy="1330325"/>
+            <wp:effectExtent l="0" t="0" r="3175" b="3175"/>
+            <wp:docPr id="2" name="Picture 2"/>
             <wp:cNvGraphicFramePr>
               <a:graphicFrameLocks xmlns:a="http://schemas.openxmlformats.org/drawingml/2006/main" noChangeAspect="1"/>
             </wp:cNvGraphicFramePr>
@@ -1083,7 +855,7 @@
                   <pic:spPr>
                     <a:xfrm>
                       <a:off x="0" y="0"/>
-                      <a:ext cx="5940425" cy="1222375"/>
+                      <a:ext cx="5940425" cy="1330325"/>
                     </a:xfrm>
                     <a:prstGeom prst="rect">
                       <a:avLst/>
@@ -1104,7 +876,6 @@
           <w:lang w:val="en-US"/>
         </w:rPr>
       </w:pPr>
-      <w:proofErr w:type="spellStart"/>
       <w:r>
         <w:rPr>
           <w:b/>
@@ -1113,10 +884,109 @@
           <w:szCs w:val="32"/>
           <w:lang w:val="en-US"/>
         </w:rPr>
-        <w:t>Loggs</w:t>
-      </w:r>
-      <w:proofErr w:type="spellEnd"/>
-      <w:r>
+        <w:t>Loggs:</w:t>
+      </w:r>
+      <w:r>
+        <w:rPr>
+          <w:sz w:val="28"/>
+          <w:szCs w:val="28"/>
+          <w:lang w:val="en-US"/>
+        </w:rPr>
+        <w:br/>
+      </w:r>
+      <w:r>
+        <w:rPr>
+          <w:sz w:val="28"/>
+          <w:szCs w:val="28"/>
+          <w:lang w:val="en-US"/>
+        </w:rPr>
+        <w:t>SUCCESS: Expected data (  13) was written to the ad</w:t>
+      </w:r>
+      <w:r>
+        <w:rPr>
+          <w:sz w:val="28"/>
+          <w:szCs w:val="28"/>
+          <w:lang w:val="en-US"/>
+        </w:rPr>
+        <w:t>d</w:t>
+      </w:r>
+      <w:r>
+        <w:rPr>
+          <w:sz w:val="28"/>
+          <w:szCs w:val="28"/>
+          <w:lang w:val="en-US"/>
+        </w:rPr>
+        <w:t>ress cell   0</w:t>
+      </w:r>
+    </w:p>
+    <w:p>
+      <w:pPr>
+        <w:rPr>
+          <w:sz w:val="28"/>
+          <w:szCs w:val="28"/>
+          <w:lang w:val="en-US"/>
+        </w:rPr>
+      </w:pPr>
+      <w:r>
+        <w:rPr>
+          <w:sz w:val="28"/>
+          <w:szCs w:val="28"/>
+          <w:lang w:val="en-US"/>
+        </w:rPr>
+        <w:t>SUCCESS: Expected data ( -64) was written to the ad</w:t>
+      </w:r>
+      <w:r>
+        <w:rPr>
+          <w:sz w:val="28"/>
+          <w:szCs w:val="28"/>
+          <w:lang w:val="en-US"/>
+        </w:rPr>
+        <w:t>d</w:t>
+      </w:r>
+      <w:r>
+        <w:rPr>
+          <w:sz w:val="28"/>
+          <w:szCs w:val="28"/>
+          <w:lang w:val="en-US"/>
+        </w:rPr>
+        <w:t>ress cell  17</w:t>
+      </w:r>
+    </w:p>
+    <w:p>
+      <w:pPr>
+        <w:rPr>
+          <w:sz w:val="28"/>
+          <w:szCs w:val="28"/>
+          <w:lang w:val="en-US"/>
+        </w:rPr>
+      </w:pPr>
+      <w:r>
+        <w:rPr>
+          <w:sz w:val="28"/>
+          <w:szCs w:val="28"/>
+          <w:lang w:val="en-US"/>
+        </w:rPr>
+        <w:t>SUCCESS: Ad</w:t>
+      </w:r>
+      <w:r>
+        <w:rPr>
+          <w:sz w:val="28"/>
+          <w:szCs w:val="28"/>
+          <w:lang w:val="en-US"/>
+        </w:rPr>
+        <w:t>d</w:t>
+      </w:r>
+      <w:r>
+        <w:rPr>
+          <w:sz w:val="28"/>
+          <w:szCs w:val="28"/>
+          <w:lang w:val="en-US"/>
+        </w:rPr>
+        <w:t>ress cell   0 was reset to zero</w:t>
+      </w:r>
+    </w:p>
+    <w:p>
+      <w:pPr>
         <w:rPr>
           <w:b/>
           <w:bCs/>
@@ -1124,109 +994,6 @@
           <w:szCs w:val="32"/>
           <w:lang w:val="en-US"/>
         </w:rPr>
-        <w:t>:</w:t>
-      </w:r>
-      <w:r>
-        <w:rPr>
-          <w:sz w:val="28"/>
-          <w:szCs w:val="28"/>
-          <w:lang w:val="en-US"/>
-        </w:rPr>
-        <w:br/>
-      </w:r>
-      <w:r>
-        <w:rPr>
-          <w:sz w:val="28"/>
-          <w:szCs w:val="28"/>
-          <w:lang w:val="en-US"/>
-        </w:rPr>
-        <w:t xml:space="preserve">SUCCESS: Expected data </w:t>
-      </w:r>
-      <w:proofErr w:type="gramStart"/>
-      <w:r>
-        <w:rPr>
-          <w:sz w:val="28"/>
-          <w:szCs w:val="28"/>
-          <w:lang w:val="en-US"/>
-        </w:rPr>
-        <w:t>(  13</w:t>
-      </w:r>
-      <w:proofErr w:type="gramEnd"/>
-      <w:r>
-        <w:rPr>
-          <w:sz w:val="28"/>
-          <w:szCs w:val="28"/>
-          <w:lang w:val="en-US"/>
-        </w:rPr>
-        <w:t>) was written to the ad</w:t>
-      </w:r>
-      <w:r>
-        <w:rPr>
-          <w:sz w:val="28"/>
-          <w:szCs w:val="28"/>
-          <w:lang w:val="en-US"/>
-        </w:rPr>
-        <w:t>d</w:t>
-      </w:r>
-      <w:r>
-        <w:rPr>
-          <w:sz w:val="28"/>
-          <w:szCs w:val="28"/>
-          <w:lang w:val="en-US"/>
-        </w:rPr>
-        <w:t>ress cell   0</w:t>
-      </w:r>
-    </w:p>
-    <w:p>
-      <w:pPr>
-        <w:rPr>
-          <w:sz w:val="28"/>
-          <w:szCs w:val="28"/>
-          <w:lang w:val="en-US"/>
-        </w:rPr>
-      </w:pPr>
-      <w:r>
-        <w:rPr>
-          <w:sz w:val="28"/>
-          <w:szCs w:val="28"/>
-          <w:lang w:val="en-US"/>
-        </w:rPr>
-        <w:t>SUCCESS: Expected data ( -64) was written to the ad</w:t>
-      </w:r>
-      <w:r>
-        <w:rPr>
-          <w:sz w:val="28"/>
-          <w:szCs w:val="28"/>
-          <w:lang w:val="en-US"/>
-        </w:rPr>
-        <w:t>d</w:t>
-      </w:r>
-      <w:r>
-        <w:rPr>
-          <w:sz w:val="28"/>
-          <w:szCs w:val="28"/>
-          <w:lang w:val="en-US"/>
-        </w:rPr>
-        <w:t xml:space="preserve">ress </w:t>
-      </w:r>
-      <w:proofErr w:type="gramStart"/>
-      <w:r>
-        <w:rPr>
-          <w:sz w:val="28"/>
-          <w:szCs w:val="28"/>
-          <w:lang w:val="en-US"/>
-        </w:rPr>
-        <w:t>cell  17</w:t>
-      </w:r>
-      <w:proofErr w:type="gramEnd"/>
-    </w:p>
-    <w:p>
-      <w:pPr>
-        <w:rPr>
-          <w:sz w:val="28"/>
-          <w:szCs w:val="28"/>
-          <w:lang w:val="en-US"/>
-        </w:rPr>
       </w:pPr>
       <w:r>
         <w:rPr>
@@ -1242,41 +1009,6 @@
           <w:szCs w:val="28"/>
           <w:lang w:val="en-US"/>
         </w:rPr>
-        <w:t>d</w:t>
-      </w:r>
-      <w:r>
-        <w:rPr>
-          <w:sz w:val="28"/>
-          <w:szCs w:val="28"/>
-          <w:lang w:val="en-US"/>
-        </w:rPr>
-        <w:t>ress cell   0 was reset to zero</w:t>
-      </w:r>
-    </w:p>
-    <w:p>
-      <w:pPr>
-        <w:rPr>
-          <w:b/>
-          <w:bCs/>
-          <w:sz w:val="32"/>
-          <w:szCs w:val="32"/>
-          <w:lang w:val="en-US"/>
-        </w:rPr>
-      </w:pPr>
-      <w:r>
-        <w:rPr>
-          <w:sz w:val="28"/>
-          <w:szCs w:val="28"/>
-          <w:lang w:val="en-US"/>
-        </w:rPr>
-        <w:t>SUCCESS: Ad</w:t>
-      </w:r>
-      <w:r>
-        <w:rPr>
-          <w:sz w:val="28"/>
-          <w:szCs w:val="28"/>
-          <w:lang w:val="en-US"/>
-        </w:rPr>
         <w:t>dr</w:t>
       </w:r>
       <w:r>
@@ -1285,25 +1017,7 @@
           <w:szCs w:val="28"/>
           <w:lang w:val="en-US"/>
         </w:rPr>
-        <w:t xml:space="preserve">ess </w:t>
-      </w:r>
-      <w:proofErr w:type="gramStart"/>
-      <w:r>
-        <w:rPr>
-          <w:sz w:val="28"/>
-          <w:szCs w:val="28"/>
-          <w:lang w:val="en-US"/>
-        </w:rPr>
-        <w:t>cell  17</w:t>
-      </w:r>
-      <w:proofErr w:type="gramEnd"/>
-      <w:r>
-        <w:rPr>
-          <w:sz w:val="28"/>
-          <w:szCs w:val="28"/>
-          <w:lang w:val="en-US"/>
-        </w:rPr>
-        <w:t xml:space="preserve"> was reset to zero</w:t>
+        <w:t>ess cell  17 was reset to zero</w:t>
       </w:r>
     </w:p>
     <w:sectPr>

</xml_diff>